<commit_message>
feat: rebuild Domain B with trade-emergent hubs; SSRN r31 in Spanish
- New reconstruccion_B_hub_comercio.py (with log): each Domain B country
  gets as hub its largest export destination in its first decade of COW
  data (same-territory Maddison 2020 entities), fitted as in Domain B.
  102/103 countries, 19 hubs; only 9/102 pairs exist in Domain B; 62/95
  nodes converge toward their hub; trade hub vs same-gap non-partners:
  median d -0.014, Wilcoxon p = 0.78 (no coupling). CMEA coverage flag.
  Report RECONSTRUCCION_DOMINIO_B_HUB_COMERCIO.md.
- SSRN r31: Spanish translation (snt_ssrn_v31.md/.pdf/.docx) and form
  text (SSRN_revision_v31.md); EN r31 updated with the reconstruction and
  three wording fixes. v30 files and PLOS materials untouched.
- README, audits index, discriminant report and CHANGELOG updated.

Co-Authored-By: Claude Opus 5.5 <noreply@anthropic.com>
Claude-Session: https://claude.ai/code/session_01MqyBgMdshDotbsa5MmPnyF
</commit_message>
<xml_diff>
--- a/papers/snt_ssrn_v31_EN.docx
+++ b/papers/snt_ssrn_v31_EN.docx
@@ -164,7 +164,7 @@
           <w:i/>
           <w:color w:val="555555"/>
         </w:rPr>
-        <w:t>, but a discriminant test leaves it supported neither as SNT coupling nor as β-convergence (§12). The v30 note below is kept for history.</w:t>
+        <w:t>, but a discriminant test leaves it supported neither as SNT coupling nor as β-convergence, and rebuilding it with hubs taken from bilateral trade instead of assigned by GDP does not recover a coupling signal (§12). The v30 note below is kept for history.</w:t>
       </w:r>
     </w:p>
     <w:p>
@@ -343,7 +343,7 @@
       </w:r>
       <w:r>
         <w:rPr/>
-        <w:t xml:space="preserve"> in this revision (see the revision note). Domain B (country pairs, 62% of the corpus) is reproduced exactly from the Maddison Project Database 2020, but a discriminant test (calibrated null plus bilateral trade from the Correlates of War) supports it neither as hub–node coupling nor as β-convergence, so the claim that political sovereignty brakes satellization like ecological interdependence is retained only as a hypothesis.</w:t>
+        <w:t xml:space="preserve"> in this revision (see the revision note). Domain B (country pairs, 62% of the corpus) is reproduced exactly from the Maddison Project Database 2020, but a discriminant test (calibrated null plus bilateral trade from the Correlates of War) supports it neither as hub–node coupling nor as β-convergence; rebuilt with each country's main export destination as its hub, two of three countries converge toward that hub, and the hub diverges no more than a partner with the same initial gap. The claim that political sovereignty brakes satellization like ecological interdependence is therefore retained only as a hypothesis.</w:t>
       </w:r>
     </w:p>
     <w:p>
@@ -620,7 +620,7 @@
     <w:p>
       <w:r>
         <w:rPr/>
-        <w:t>Institutional-friction effect: Spearman correlation between an a-priori friction index (ordinal 0–3) and b per case (social/biological domains). Regime separation: Mann-Whitney U between friction-free and friction-laden economic domains. Because cases are clustered within domains, r31 adds cluster-level Spearman (domain means), a cluster bootstrap and domain-exclusion variants (without E3; without E3 and B); serial autocorrelation of Domain B fits is handled with an AR(1) effective-n correction (Durbin-Watson). The trigger-type effect (abrupt vs gradual) was recalculated on every trigger-labeled dataset in the repository (§5). Domain B's construct is examined with a discriminant test: correlation of b with the initial GDP gap compared against a synthetic null calibrated to the Maddison data (the hub is assigned by mean GDP, which couples gap and slope by construction), and correlation of b with bilateral trade shares (Correlates of War Trade v4.0). Collapse layer: Spearman ρ(b, Δ) for orthogonality and Kaplan-Meier survival for the hazard. Significance threshold α = 0.05; all tests in Python 3.11 (scipy.stats); scripts in the public repository.</w:t>
+        <w:t>Institutional-friction effect: Spearman correlation between an a-priori friction index (ordinal 0–3) and b per case (social/biological domains). Regime separation: Mann-Whitney U between friction-free and friction-laden economic domains. Because cases are clustered within domains, r31 adds cluster-level Spearman (domain means), a cluster bootstrap and domain-exclusion variants (without E3; without E3 and B); serial autocorrelation of Domain B fits is handled with an AR(1) effective-n correction (Durbin-Watson). The trigger-type effect (abrupt vs gradual) was recalculated on every trigger-labeled dataset in the repository (§5). Domain B's construct is examined with a discriminant test: correlation of b with the initial GDP gap compared against a synthetic null calibrated to the Maddison data (the hub is assigned by mean GDP, which couples gap and slope by construction), and correlation of b with bilateral trade shares (Correlates of War Trade v4.0). Domain B is also rebuilt with a hub that emerges from trade (each country's largest export destination in its first decade of data), fitted identically, and the trade hub is compared with partners matched on initial gap. Collapse layer: Spearman ρ(b, Δ) for orthogonality and Kaplan-Meier survival for the hazard. Significance threshold α = 0.05; all tests in Python 3.11 (scipy.stats); scripts in the public repository.</w:t>
       </w:r>
     </w:p>
     <w:p/>
@@ -988,7 +988,7 @@
       </w:r>
       <w:r>
         <w:rPr/>
-        <w:t xml:space="preserve"> this version retires the previously posted 502-case corpus, which contained synthetic values, and replaces it with 721 cases reconstructed from verifiable primary sources (R² ∈ [0,1]; 89% significant). The collapse layer (Section 13) is correlational and, on the crypto side, based on small n; it is framed as a strong hypothesis, not causal proof.</w:t>
+        <w:t xml:space="preserve"> this version retires the previously posted 502-case corpus, which contained synthetic values, and replaces it with 721 cases reconstructed from verifiable primary sources (R² ∈ [0,1]; 89% nominally significant). The collapse layer (Section 13) is correlational and, on the crypto side, based on small n; it is framed as a strong hypothesis, not causal proof.</w:t>
       </w:r>
     </w:p>
     <w:p>
@@ -1030,7 +1030,7 @@
       </w:r>
       <w:r>
         <w:rPr/>
-        <w:t xml:space="preserve"> the hub is assigned by mean GDP, and 77 of 91 countries (85%) appear both as hub and as satellite, so the role is a property of the pair, not a network position. (iv) </w:t>
+        <w:t xml:space="preserve"> the hub is assigned by mean GDP, and 77 of the 91 countries that act as hub in some pair (85%) are satellite in another, so the role is a property of the pair, not a network position; rebuilt with trade-emergent hubs, only 9 of 102 hub–node trade pairs are in Domain B, and the main export destination changes by 2005–2014 for 77 of 102 countries, so a single fixed hub over 50–119 years is itself a strong approximation. (iv) </w:t>
       </w:r>
       <w:r>
         <w:rPr>
@@ -1536,7 +1536,7 @@
       </w:r>
       <w:r>
         <w:rPr/>
-        <w:t xml:space="preserve"> b (ρ = −0.185; cluster-by-node p = 0.022), opposite to the coupling prediction. Domain B is therefore supported neither as hub–node coupling nor as β-convergence, and the sovereignty-as-brake statement is kept as a hypothesis. v30 closed this finding with the contrast that, when resource transfer is direct and unmediated (a herring shoal cannot negotiate with a school of mackerel; a Hot Jupiter does not apply for regulatory approval), b exceeds 1 regardless of substrate. In the corpus 94 of the 102 cases with b ≥ 1 are COVID-19 spread series (E1 + E3), and the band may partly reflect misspecification (Finding 5), so r31 states it as a conjecture.</w:t>
+        <w:t xml:space="preserve"> b (ρ = −0.185; cluster-by-node p = 0.022), opposite to the coupling prediction. Domain B is therefore supported neither as hub–node coupling nor as β-convergence. (c) Rebuilt with a hub that emerges from trade — each country's largest export destination in its first decade of COW data (102 of 103 countries; 19 distinct hubs, mostly the United Kingdom and the United States) — only 9 of the 102 trade hub–node pairs exist in Domain B, 62 of the 95 nodes whose hub was richer converge toward it (b &lt; 0), and the trade hub diverges no more than up to five partners with the same initial gap that are not major trade partners (median difference −0.014; 45/102 positive; Wilcoxon p = 0.78; clustered by hub, p = 0.62). A within-country comparison across partners gives a weak, non-robust positive association between export share and b (median partial ρ = +0.115; sign-flip permutation p = 0.15). The sovereignty-as-brake statement is kept as a hypothesis. v30 closed this finding with the contrast that, when resource transfer is direct and unmediated (a herring shoal cannot negotiate with a school of mackerel; a Hot Jupiter does not apply for regulatory approval), b exceeds 1 regardless of substrate. In the corpus 94 of the 102 cases with b ≥ 1 are COVID-19 spread series (E1 + E3), and the band may partly reflect misspecification (Finding 5), so r31 states it as a conjecture.</w:t>
       </w:r>
     </w:p>
     <w:p>
@@ -1735,7 +1735,7 @@
       </w:r>
       <w:r>
         <w:rPr/>
-        <w:t xml:space="preserve"> The satellization cycle — from dependent child node to peer to hub of new children — operates across all domains. The five-level taxonomy is verifiable with INEGI data and follows a power law; the binary model underestimated Tlaxcala's satellization by 9.3×; the first documented leapfrog cases within the Mexican national system are verified (Querétaro b = −0.155, Nuevo León b = −0.058); the ASI is computable from behavior on 4,774 users (its validation remains open, §6.6). With the real 721-case corpus, </w:t>
+        <w:t xml:space="preserve"> SNT proposes that the satellization cycle — from dependent child node to peer to hub of new children — operates across domains; the corpus documents power-law-like trajectories in every domain it covers, with the inference caveats of §9 and §12. The five-level taxonomy is consistent with a rank-size power law in INEGI data (pending a lognormal comparison); the binary model underestimated Tlaxcala's satellization by 9.3×; the first documented leapfrog cases within the Mexican national system are verified (Querétaro b = −0.155, Nuevo León b = −0.058); the ASI is computable from behavior on 4,774 users (its validation remains open, §6.6). With the real 721-case corpus, </w:t>
       </w:r>
       <w:r>
         <w:rPr>
@@ -1757,7 +1757,7 @@
       </w:r>
       <w:r>
         <w:rPr/>
-        <w:t xml:space="preserve"> That leapfrog is always possible for any node. The model formalizes viability conditions and failure mechanisms but does not guarantee success. The Micro and Macro modules require independent empirical validation; the ASI requires validation against an outcome independent of its own threshold; the collapse layer is correlational and requires larger cohorts and cross-domain tests. SNT does not demonstrate that Domain B measures hub–node coupling: a discriminant test with a calibrated null and bilateral trade data does not support that reading (§12, Finding 4).</w:t>
+        <w:t xml:space="preserve"> That leapfrog is always possible for any node. The model formalizes viability conditions and failure mechanisms but does not guarantee success. The Micro and Macro modules require independent empirical validation; the ASI requires validation against an outcome independent of its own threshold; the collapse layer is correlational and requires larger cohorts and cross-domain tests. SNT does not demonstrate that Domain B measures hub–node coupling: a discriminant test with a calibrated null and bilateral trade data does not support that reading, and neither does a reconstruction with hubs taken from trade (§12, Finding 4).</w:t>
       </w:r>
     </w:p>
     <w:p>
@@ -1769,7 +1769,7 @@
       </w:r>
       <w:r>
         <w:rPr/>
-        <w:t xml:space="preserve"> Validation of the Micro Module with longitudinal individual trajectory data; ASI operationalization with other platforms; extension of the N-body matrix to other national systems; cross-domain orthogonality test for b ⊥ Δ; larger survivorship-unbiased cohorts for h(τ); pre-registration before claiming causality. Added in r31: Newey-West/GLS estimation on raw residuals to pin the autocorrelation-corrected significance of Domain B; recovery of the raw COVID-19 series to correct E1/E3; re-testing the superlinear band against exponential and lognormal models; a satellization corpus with independently coded triggers; and rebuilding Domain B with a hub that emerges from the trade network instead of being assigned by GDP.</w:t>
+        <w:t xml:space="preserve"> Validation of the Micro Module with longitudinal individual trajectory data; ASI operationalization with other platforms; extension of the N-body matrix to other national systems; cross-domain orthogonality test for b ⊥ Δ; larger survivorship-unbiased cohorts for h(τ); pre-registration before claiming causality. Added in r31: Newey-West/GLS estimation on raw residuals to pin the autocorrelation-corrected significance of Domain B; recovery of the raw COVID-19 series to correct E1/E3; re-testing the superlinear band against exponential and lognormal models; a satellization corpus with independently coded triggers; and, since Domain B rebuilt with trade-emergent hubs shows no coupling, a time-varying hub definition (the main export destination changes for most countries) before any further use of country pairs as satellization evidence.</w:t>
       </w:r>
     </w:p>
     <w:p>
@@ -2044,7 +2044,7 @@
     <w:p>
       <w:r>
         <w:rPr/>
-        <w:t>Zainos Corona, E. (2026). Shadow Node Theory — Replication Package v2.5.0 (721-case real corpus + Coupled Collapse layer ACO-A). Zenodo. https://doi.org/10.5281/zenodo.19446521. Current repository (release v2.5.2, integral audit v32, discriminant test of Domain B): https://github.com/Inzainos/The-shadow-Node-Theory</w:t>
+        <w:t>Zainos Corona, E. (2026). Shadow Node Theory — Replication Package v2.5.0 (721-case real corpus + Coupled Collapse layer ACO-A). Zenodo. https://doi.org/10.5281/zenodo.19446521. Current repository (release v2.5.2, integral audit v32, discriminant test and reconstruction of Domain B): https://github.com/Inzainos/The-shadow-Node-Theory</w:t>
       </w:r>
     </w:p>
     <w:p>

</xml_diff>